<commit_message>
Bruno & Marrone: revisão da Parte 4 (precisão e anti-IA)
Co-Authored-By: Claude Opus 5.5 <noreply@anthropic.com>
Claude-Session: https://claude.ai/code/session_01MJjUEEZrxQDEUifKK2vj9g
</commit_message>
<xml_diff>
--- a/roteiros/bruno-marrone/BrunoMarrone_Parte4.docx
+++ b/roteiros/bruno-marrone/BrunoMarrone_Parte4.docx
@@ -23,7 +23,7 @@
         <w:rPr>
           <w:color w:val="000000"/>
         </w:rPr>
-        <w:t>Bruno e Marrone continuaram na estrada. A agenda seguiu cheia, as plateias continuaram lotando os parques de exposição, e os dois continuaram dividindo o mesmo palco noite após noite, cada um do seu lado.</w:t>
+        <w:t>Bruno e Marrone continuaram na estrada, com a agenda cheia. Noite após noite, os dois dividiam o mesmo palco, cada um do seu lado.</w:t>
       </w:r>
     </w:p>
     <w:p>
@@ -79,7 +79,7 @@
         <w:rPr>
           <w:color w:val="000000"/>
         </w:rPr>
-        <w:t>Os filhos perceberam que a mãe mudou depois da morte do marido. Ela ficou mais frágil, mais quieta. Aos poucos, veio o diagnóstico de Alzheimer.</w:t>
+        <w:t>Depois da morte do marido, ela ficou cada vez mais frágil. Aos poucos, veio o diagnóstico de Alzheimer.</w:t>
       </w:r>
     </w:p>
     <w:p>
@@ -87,7 +87,7 @@
         <w:rPr>
           <w:color w:val="C00000"/>
         </w:rPr>
-        <w:t>Guarde o nome de dona Anita. Porque essa mulher, que criou cinco filhos e viu um deles virar a voz mais tocada do país, vai ser o centro de uma das cenas mais tristes dessa história. Uma cena que aconteceu justamente numa noite de Natal.</w:t>
+        <w:t>Guarde o nome de dona Anita. Porque essa mulher, que criou cinco filhos e viu um deles virar a voz mais tocada do país, vai ser o centro de uma das cenas mais tristes dessa história. Uma cena que aconteceu justamente numa madrugada de Natal.</w:t>
       </w:r>
     </w:p>
     <w:p>
@@ -103,7 +103,7 @@
         <w:rPr>
           <w:color w:val="000000"/>
         </w:rPr>
-        <w:t>Ele é casado com Marianne Rabelo. Com ela, teve os gêmeos Enzo e Maria Eduarda, nascidos em quatro de fevereiro de dois mil e oito. Bruno tem ainda um filho mais velho, Vinícius.</w:t>
+        <w:t>Ele é casado com Marianne Rabelo. Com ela, teve os gêmeos Enzo e Maria Eduarda, nascidos em quatro de fevereiro de dois mil e oito. Bruno tem ainda outro filho, Vinícius.</w:t>
       </w:r>
     </w:p>
     <w:p>
@@ -175,7 +175,7 @@
         <w:rPr>
           <w:color w:val="000000"/>
         </w:rPr>
-        <w:t>Tudo começou com uma dor de cabeça. Marrone foi ao médico, fez exames de rotina e recebeu uma notícia que ninguém esperava. Estava com glaucoma avançado nos dois olhos.</w:t>
+        <w:t>Tudo começou com uma dor de cabeça. Marrone foi ao médico para uma consulta que parecia simples, e os exames mostraram uma coisa que ninguém esperava. Glaucoma avançado, nos dois olhos.</w:t>
       </w:r>
     </w:p>
     <w:p>
@@ -191,7 +191,7 @@
         <w:rPr>
           <w:color w:val="000000"/>
         </w:rPr>
-        <w:t>No dia dezessete de junho, Marrone foi operado com urgência num hospital de olhos, nos dois olhos.</w:t>
+        <w:t>No dia dezessete de junho, Marrone foi operado com urgência.</w:t>
       </w:r>
     </w:p>
     <w:p>
@@ -199,7 +199,7 @@
         <w:rPr>
           <w:color w:val="000000"/>
         </w:rPr>
-        <w:t>A irmã dele, Cida, contou à imprensa que ele tinha ido apenas fazer exames de rotina, e que o médico decidiu operar na hora, ao ver como a doença estava avançada.</w:t>
+        <w:t>A irmã dele, Cida, contou à imprensa que o médico decidiu operar ali mesmo, ao ver como a doença estava avançada.</w:t>
       </w:r>
     </w:p>
     <w:p>
@@ -207,7 +207,7 @@
         <w:rPr>
           <w:color w:val="000000"/>
         </w:rPr>
-        <w:t>A cirurgia salvou a visão central. Mas ele perdeu parte da visão periférica, aquela que enxerga o que acontece nos lados.</w:t>
+        <w:t>A visão central foi preservada. Mas a doença já tinha levado parte da visão periférica, aquela que enxerga o que acontece nos lados.</w:t>
       </w:r>
     </w:p>
     <w:p>
@@ -239,7 +239,7 @@
         <w:rPr>
           <w:color w:val="C00000"/>
         </w:rPr>
-        <w:t>Pense no que isso significa. Durante quase quarenta anos, Marrone foi o homem que ficava de olho no parceiro, do lado direito do palco, pronto para consertar qualquer coisa. E foi justamente a visão dos lados que ele perdeu.</w:t>
+        <w:t>Pense no que isso significa. Durante quase quarenta anos, Marrone foi o homem que ficava de olho no parceiro, ao lado dele no palco, pronto para consertar qualquer coisa. E foi justamente a visão dos lados que ele perdeu.</w:t>
       </w:r>
     </w:p>
     <w:p>
@@ -327,7 +327,7 @@
         <w:rPr>
           <w:color w:val="000000"/>
         </w:rPr>
-        <w:t>A nota da dupla saiu poucas horas depois: "Com imenso pesar comunicamos o falecimento aos oitenta e um anos de Ana Félix de Miranda, conhecida como Dona Anita, mãe do Bruno."</w:t>
+        <w:t>A dupla divulgou uma nota: "Com imenso pesar comunicamos o falecimento aos oitenta e um anos de Ana Félix de Miranda, conhecida como Dona Anita, mãe do Bruno."</w:t>
       </w:r>
     </w:p>
     <w:p>
@@ -423,7 +423,7 @@
         <w:rPr>
           <w:color w:val="000000"/>
         </w:rPr>
-        <w:t>Numa das montagens, aparecia Marrone chorando, como se estivesse contando a notícia ao público. Em outra, era Enzo, o filho de Bruno, que aparecia em lágrimas.</w:t>
+        <w:t>Numa das montagens, aparecia Marrone chorando, como se tivesse acabado de receber a notícia. Em outra, era Enzo, o filho de Bruno, que aparecia em lágrimas.</w:t>
       </w:r>
     </w:p>
     <w:p>
@@ -447,7 +447,7 @@
         <w:rPr>
           <w:color w:val="000000"/>
         </w:rPr>
-        <w:t>Contou que tinham criado montagens do filho chorando e do parceiro chorando. E brincou: "Confundiram o Bruno. Deve ser outro Bruno, coitado."</w:t>
+        <w:t>Contou que tinham criado montagens do filho chorando e do parceiro chorando. E brincou que deviam ter confundido com outro Bruno, coitado.</w:t>
       </w:r>
     </w:p>
     <w:p>
@@ -471,7 +471,7 @@
         <w:rPr>
           <w:color w:val="000000"/>
         </w:rPr>
-        <w:t>A mentira funcionou porque se apoiava numa imagem que o público já tinha na cabeça. Desde as lives da pandemia, desde a entrevista de dois mil e vinte e um, o Brasil se acostumou a enxergar Marrone como o homem que carrega o peso da dupla. Bastou uma máquina colocar lágrimas no rosto dele para muita gente acreditar.</w:t>
+        <w:t>A mentira funcionou porque se apoiava numa imagem que o público já tinha na cabeça. Desde as lives da pandemia, desde a entrevista de dois mil e vinte e um, o Brasil se acostumou a enxergar Marrone como o homem que carrega o peso da dupla. Bastou uma máquina colocar lágrimas no rosto dele para o boato correr o país.</w:t>
       </w:r>
     </w:p>
     <w:p>
@@ -487,7 +487,7 @@
         <w:rPr>
           <w:color w:val="C00000"/>
         </w:rPr>
-        <w:t>E agora você vai ver as duas cenas que, em apenas três dias, resumem quarenta anos dessa dupla. A primeira é a mais bonita de toda a carreira deles. A segunda é aquela que milhares de fãs, até hoje, não conseguem esquecer.</w:t>
+        <w:t>E agora você vai ver as duas cenas que, em apenas três dias, resumem quarenta anos dessa dupla. A primeira é uma das mais bonitas de toda a carreira deles. A segunda é aquela que milhares de fãs gostariam de apagar da memória.</w:t>
       </w:r>
     </w:p>
     <w:p>
@@ -559,7 +559,7 @@
         <w:rPr>
           <w:color w:val="1F4EB4"/>
         </w:rPr>
-        <w:t>Marrone lembrou dos palcos pequenos do começo, das noites em que ninguém prestava atenção. E disse uma frase sobre o parceiro que, dias depois, ia ganhar outro peso.</w:t>
+        <w:t>Marrone lembrou do tempo em que a dupla cantava nos palcos menores da festa, antes de chegar ao principal. E disse uma frase sobre o parceiro que, dias depois, ia ganhar outro peso.</w:t>
       </w:r>
     </w:p>
     <w:p>
@@ -615,7 +615,7 @@
         <w:rPr>
           <w:color w:val="1F4EB4"/>
         </w:rPr>
-        <w:t>Segundo relatos de vários espectadores, Bruno parecia alterado. Tinha dificuldade para conduzir algumas músicas. E os dois quase não interagiam. Entre uma canção e outra, o que os fãs viam era distância.</w:t>
+        <w:t>Segundo relatos de vários espectadores, Bruno parecia alterado e tinha dificuldade para conduzir algumas músicas. Os dois quase não interagiam. Entre uma canção e outra, o que os fãs viam era distância.</w:t>
       </w:r>
     </w:p>
     <w:p>
@@ -647,7 +647,7 @@
         <w:rPr>
           <w:color w:val="1F4EB4"/>
         </w:rPr>
-        <w:t>Uma fã contou que tinha ido ao show com o pé fraturado, só para ver a dupla que acompanhava a vida inteira. E voltou para casa decepcionada.</w:t>
+        <w:t>Uma fã contou que tinha ido ao show mesmo com o pé fraturado. E voltou para casa decepcionada.</w:t>
       </w:r>
     </w:p>
     <w:p>
@@ -655,7 +655,7 @@
         <w:rPr>
           <w:color w:val="1F4EB4"/>
         </w:rPr>
-        <w:t>A comparação apareceu em seguida. Patos de Minas, dois mil e dezessete. Nove anos depois, a mesma cena voltava a circular, agora em Uberlândia.</w:t>
+        <w:t>A comparação apareceu em seguida. Patos de Minas, dois mil e dezessete. Nove anos depois, muitos fãs acharam que estavam vendo a mesma cena de novo, agora em Uberlândia.</w:t>
       </w:r>
     </w:p>
     <w:p>
@@ -695,7 +695,7 @@
         <w:rPr>
           <w:color w:val="C00000"/>
         </w:rPr>
-        <w:t>Mas essa história ainda não terminou em Uberlândia. Menos de um mês depois, Marrone apareceu diante das câmeras num lugar onde ninguém esperava encontrá-lo. No velório de outro cantor sertanejo. E ali, com a voz embargada, ele repetiu duas palavras que você ouviu no começo desse vídeo.</w:t>
+        <w:t>Mas essa história ainda não terminou em Uberlândia. Menos de um mês depois, Marrone apareceu diante das câmeras num lugar onde ninguém esperava encontrá-lo. No velório de outro cantor sertanejo. E ali, diante do caixão de um colega, ele repetiu duas palavras que você já ouviu nessa história.</w:t>
       </w:r>
     </w:p>
     <w:sectPr>

</xml_diff>